<commit_message>
Updated PPT and report
</commit_message>
<xml_diff>
--- a/PPT and Report/COOP-II-Project Report Format (002).docx
+++ b/PPT and Report/COOP-II-Project Report Format (002).docx
@@ -390,21 +390,26 @@
           <w:bCs/>
         </w:rPr>
       </w:pPr>
-      <w:proofErr w:type="gramStart"/>
-      <w:r>
-        <w:rPr>
-          <w:b/>
-          <w:bCs/>
-        </w:rPr>
-        <w:t>Salil  (</w:t>
-      </w:r>
-      <w:proofErr w:type="gramEnd"/>
-      <w:r>
-        <w:rPr>
-          <w:b/>
-          <w:bCs/>
-        </w:rPr>
-        <w:t>2210992030)</w:t>
+      <w:r>
+        <w:rPr>
+          <w:b/>
+          <w:bCs/>
+        </w:rPr>
+        <w:t>Salil  (2210992</w:t>
+      </w:r>
+      <w:r>
+        <w:rPr>
+          <w:b/>
+          <w:bCs/>
+        </w:rPr>
+        <w:t>2</w:t>
+      </w:r>
+      <w:r>
+        <w:rPr>
+          <w:b/>
+          <w:bCs/>
+        </w:rPr>
+        <w:t>30)</w:t>
       </w:r>
       <w:r>
         <w:rPr>
@@ -436,23 +441,7 @@
           <w:b/>
           <w:bCs/>
         </w:rPr>
-        <w:t xml:space="preserve">Palak   </w:t>
-      </w:r>
-      <w:proofErr w:type="gramStart"/>
-      <w:r>
-        <w:rPr>
-          <w:b/>
-          <w:bCs/>
-        </w:rPr>
-        <w:t xml:space="preserve">   (</w:t>
-      </w:r>
-      <w:proofErr w:type="gramEnd"/>
-      <w:r>
-        <w:rPr>
-          <w:b/>
-          <w:bCs/>
-        </w:rPr>
-        <w:t>2210992013)</w:t>
+        <w:t>Palak      (2210992013)</w:t>
       </w:r>
       <w:r>
         <w:rPr>
@@ -504,7 +493,6 @@
         </w:rPr>
         <w:tab/>
       </w:r>
-      <w:proofErr w:type="gramStart"/>
       <w:r>
         <w:rPr>
           <w:b/>
@@ -518,15 +506,7 @@
           <w:b/>
           <w:bCs/>
         </w:rPr>
-        <w:t>and</w:t>
-      </w:r>
-      <w:proofErr w:type="gramEnd"/>
-      <w:r>
-        <w:rPr>
-          <w:b/>
-          <w:bCs/>
-        </w:rPr>
-        <w:t xml:space="preserve"> Engineering</w:t>
+        <w:t>and Engineering</w:t>
       </w:r>
       <w:r>
         <w:rPr>
@@ -556,39 +536,22 @@
           <w:b/>
           <w:bCs/>
         </w:rPr>
-        <w:t xml:space="preserve">Ravinder Singh </w:t>
-      </w:r>
-      <w:proofErr w:type="gramStart"/>
-      <w:r>
-        <w:rPr>
-          <w:b/>
-          <w:bCs/>
-        </w:rPr>
-        <w:t>Tiwana  (</w:t>
-      </w:r>
-      <w:proofErr w:type="gramEnd"/>
-      <w:r>
-        <w:rPr>
-          <w:b/>
-          <w:bCs/>
-        </w:rPr>
-        <w:t>2210992142)</w:t>
-      </w:r>
-      <w:r>
-        <w:rPr>
-          <w:b/>
-          <w:bCs/>
-        </w:rPr>
-        <w:tab/>
-      </w:r>
-      <w:r>
-        <w:rPr>
-          <w:b/>
-          <w:bCs/>
-        </w:rPr>
-        <w:tab/>
-      </w:r>
-      <w:proofErr w:type="gramStart"/>
+        <w:t>Ravinder Singh Tiwana  (2210992142)</w:t>
+      </w:r>
+      <w:r>
+        <w:rPr>
+          <w:b/>
+          <w:bCs/>
+        </w:rPr>
+        <w:tab/>
+      </w:r>
+      <w:r>
+        <w:rPr>
+          <w:b/>
+          <w:bCs/>
+        </w:rPr>
+        <w:tab/>
+      </w:r>
       <w:r>
         <w:rPr>
           <w:b/>
@@ -602,15 +565,7 @@
           <w:b/>
           <w:bCs/>
         </w:rPr>
-        <w:t>Chitkara</w:t>
-      </w:r>
-      <w:proofErr w:type="gramEnd"/>
-      <w:r>
-        <w:rPr>
-          <w:b/>
-          <w:bCs/>
-        </w:rPr>
-        <w:t xml:space="preserve"> University, Punjab</w:t>
+        <w:t>Chitkara University, Punjab</w:t>
       </w:r>
     </w:p>
     <w:p>
@@ -1080,23 +1035,13 @@
                 <w:szCs w:val="28"/>
               </w:rPr>
             </w:pPr>
-            <w:proofErr w:type="spellStart"/>
             <w:r>
               <w:rPr>
                 <w:rFonts w:ascii="Times New Roman" w:eastAsia="Times New Roman" w:hAnsi="Times New Roman" w:cs="Times New Roman"/>
                 <w:sz w:val="28"/>
                 <w:szCs w:val="28"/>
               </w:rPr>
-              <w:t>S.No</w:t>
-            </w:r>
-            <w:proofErr w:type="spellEnd"/>
-            <w:r>
-              <w:rPr>
-                <w:rFonts w:ascii="Times New Roman" w:eastAsia="Times New Roman" w:hAnsi="Times New Roman" w:cs="Times New Roman"/>
-                <w:sz w:val="28"/>
-                <w:szCs w:val="28"/>
-              </w:rPr>
-              <w:t>.</w:t>
+              <w:t>S.No.</w:t>
             </w:r>
           </w:p>
         </w:tc>
@@ -3560,25 +3505,7 @@
           <w:sz w:val="28"/>
           <w:szCs w:val="28"/>
         </w:rPr>
-        <w:t xml:space="preserve">I also express my sincere appreciation to all those </w:t>
-      </w:r>
-      <w:proofErr w:type="gramStart"/>
-      <w:r>
-        <w:rPr>
-          <w:rFonts w:ascii="Times New Roman" w:eastAsia="Times New Roman" w:hAnsi="Times New Roman" w:cs="Times New Roman"/>
-          <w:sz w:val="28"/>
-          <w:szCs w:val="28"/>
-        </w:rPr>
-        <w:t>who  contributed</w:t>
-      </w:r>
-      <w:proofErr w:type="gramEnd"/>
-      <w:r>
-        <w:rPr>
-          <w:rFonts w:ascii="Times New Roman" w:eastAsia="Times New Roman" w:hAnsi="Times New Roman" w:cs="Times New Roman"/>
-          <w:sz w:val="28"/>
-          <w:szCs w:val="28"/>
-        </w:rPr>
-        <w:t xml:space="preserve"> to the successful completion of this project.</w:t>
+        <w:t>I also express my sincere appreciation to all those who  contributed to the successful completion of this project.</w:t>
       </w:r>
     </w:p>
     <w:p>
@@ -3834,25 +3761,7 @@
           <w:sz w:val="24"/>
           <w:szCs w:val="24"/>
         </w:rPr>
-        <w:t xml:space="preserve">Modern PLM systems integrate technologies such as Digital Thread, Digital Twin, and Model-Based Systems Engineering (MBSE). The Digital Thread enables continuous data flow across all lifecycle stages, while Digital Twin technology supports real-time monitoring and predictive maintenance. MBSE improves system design and validation through digital </w:t>
-      </w:r>
-      <w:proofErr w:type="spellStart"/>
-      <w:r>
-        <w:rPr>
-          <w:rFonts w:ascii="Times New Roman" w:eastAsia="Times New Roman" w:hAnsi="Times New Roman" w:cs="Times New Roman"/>
-          <w:sz w:val="24"/>
-          <w:szCs w:val="24"/>
-        </w:rPr>
-        <w:t>modeling</w:t>
-      </w:r>
-      <w:proofErr w:type="spellEnd"/>
-      <w:r>
-        <w:rPr>
-          <w:rFonts w:ascii="Times New Roman" w:eastAsia="Times New Roman" w:hAnsi="Times New Roman" w:cs="Times New Roman"/>
-          <w:sz w:val="24"/>
-          <w:szCs w:val="24"/>
-        </w:rPr>
-        <w:t xml:space="preserve"> and simulation.</w:t>
+        <w:t>Modern PLM systems integrate technologies such as Digital Thread, Digital Twin, and Model-Based Systems Engineering (MBSE). The Digital Thread enables continuous data flow across all lifecycle stages, while Digital Twin technology supports real-time monitoring and predictive maintenance. MBSE improves system design and validation through digital modeling and simulation.</w:t>
       </w:r>
     </w:p>
     <w:p>
@@ -3959,25 +3868,7 @@
           <w:szCs w:val="24"/>
         </w:rPr>
         <w:lastRenderedPageBreak/>
-        <w:t xml:space="preserve">The study involved collecting information from research papers, technical journals, industrial case studies, and whitepapers related to aerospace PLM systems. Different layers of PLM architecture, including the Authoring Layer, PLM Core Layer, Integration Layer, and Enterprise Layer, were </w:t>
-      </w:r>
-      <w:proofErr w:type="spellStart"/>
-      <w:r>
-        <w:rPr>
-          <w:rFonts w:ascii="Times New Roman" w:eastAsia="Times New Roman" w:hAnsi="Times New Roman" w:cs="Times New Roman"/>
-          <w:sz w:val="24"/>
-          <w:szCs w:val="24"/>
-        </w:rPr>
-        <w:t>analyzed</w:t>
-      </w:r>
-      <w:proofErr w:type="spellEnd"/>
-      <w:r>
-        <w:rPr>
-          <w:rFonts w:ascii="Times New Roman" w:eastAsia="Times New Roman" w:hAnsi="Times New Roman" w:cs="Times New Roman"/>
-          <w:sz w:val="24"/>
-          <w:szCs w:val="24"/>
-        </w:rPr>
-        <w:t xml:space="preserve"> to understand system connectivity and lifecycle integration.</w:t>
+        <w:t>The study involved collecting information from research papers, technical journals, industrial case studies, and whitepapers related to aerospace PLM systems. Different layers of PLM architecture, including the Authoring Layer, PLM Core Layer, Integration Layer, and Enterprise Layer, were analyzed to understand system connectivity and lifecycle integration.</w:t>
       </w:r>
     </w:p>
     <w:p>
@@ -4276,43 +4167,7 @@
           <w:sz w:val="24"/>
           <w:szCs w:val="24"/>
         </w:rPr>
-        <w:t xml:space="preserve">MBSE digitally </w:t>
-      </w:r>
-      <w:proofErr w:type="gramStart"/>
-      <w:r>
-        <w:rPr>
-          <w:rFonts w:ascii="Times New Roman" w:eastAsia="Times New Roman" w:hAnsi="Times New Roman" w:cs="Times New Roman"/>
-          <w:sz w:val="24"/>
-          <w:szCs w:val="24"/>
-        </w:rPr>
-        <w:t>models</w:t>
-      </w:r>
-      <w:proofErr w:type="gramEnd"/>
-      <w:r>
-        <w:rPr>
-          <w:rFonts w:ascii="Times New Roman" w:eastAsia="Times New Roman" w:hAnsi="Times New Roman" w:cs="Times New Roman"/>
-          <w:sz w:val="24"/>
-          <w:szCs w:val="24"/>
-        </w:rPr>
-        <w:t xml:space="preserve"> system requirements, architecture, and </w:t>
-      </w:r>
-      <w:proofErr w:type="spellStart"/>
-      <w:r>
-        <w:rPr>
-          <w:rFonts w:ascii="Times New Roman" w:eastAsia="Times New Roman" w:hAnsi="Times New Roman" w:cs="Times New Roman"/>
-          <w:sz w:val="24"/>
-          <w:szCs w:val="24"/>
-        </w:rPr>
-        <w:t>behavior</w:t>
-      </w:r>
-      <w:proofErr w:type="spellEnd"/>
-      <w:r>
-        <w:rPr>
-          <w:rFonts w:ascii="Times New Roman" w:eastAsia="Times New Roman" w:hAnsi="Times New Roman" w:cs="Times New Roman"/>
-          <w:sz w:val="24"/>
-          <w:szCs w:val="24"/>
-        </w:rPr>
-        <w:t xml:space="preserve"> to improve system reliability and reduce development risks.</w:t>
+        <w:t>MBSE digitally models system requirements, architecture, and behavior to improve system reliability and reduce development risks.</w:t>
       </w:r>
     </w:p>
     <w:p>

</xml_diff>